<commit_message>
Add detailed team presentation video script in docx format
</commit_message>
<xml_diff>
--- a/4.Project Planning Phase/Project Planning.docx
+++ b/4.Project Planning Phase/Project Planning.docx
@@ -2,1334 +2,6 @@
 <file path=word/document.xml><?xml version="1.0" encoding="utf-8"?>
 <w:document xmlns:wpc="http://schemas.microsoft.com/office/word/2010/wordprocessingCanvas" xmlns:mo="http://schemas.microsoft.com/office/mac/office/2008/main" xmlns:mc="http://schemas.openxmlformats.org/markup-compatibility/2006" xmlns:mv="urn:schemas-microsoft-com:mac:vml" xmlns:o="urn:schemas-microsoft-com:office:office" xmlns:r="http://schemas.openxmlformats.org/officeDocument/2006/relationships" xmlns:m="http://schemas.openxmlformats.org/officeDocument/2006/math" xmlns:v="urn:schemas-microsoft-com:vml" xmlns:wp14="http://schemas.microsoft.com/office/word/2010/wordprocessingDrawing" xmlns:wp="http://schemas.openxmlformats.org/drawingml/2006/wordprocessingDrawing" xmlns:w10="urn:schemas-microsoft-com:office:word" xmlns:w="http://schemas.openxmlformats.org/wordprocessingml/2006/main" xmlns:w14="http://schemas.microsoft.com/office/word/2010/wordml" xmlns:wpg="http://schemas.microsoft.com/office/word/2010/wordprocessingGroup" xmlns:wpi="http://schemas.microsoft.com/office/word/2010/wordprocessingInk" xmlns:wne="http://schemas.microsoft.com/office/word/2006/wordml" xmlns:wps="http://schemas.microsoft.com/office/word/2010/wordprocessingShape" mc:Ignorable="w14 wp14">
   <w:body>
-    <w:p>
-      <w:pPr>
-        <w:pStyle w:val="Heading1"/>
-      </w:pPr>
-      <w:r>
-        <w:t>Project Planning</w:t>
-      </w:r>
-    </w:p>
-    <w:p>
-      <w:pPr>
-        <w:pStyle w:val="Heading2"/>
-      </w:pPr>
-      <w:r>
-        <w:t>1. Overview</w:t>
-      </w:r>
-    </w:p>
-    <w:p>
-      <w:r>
-        <w:t>The Project Planning document outlines the project schedule, development phases, sprint breakdowns, and risk assessments. It serves as a guide to ensure timely delivery of all project milestones and functional features.</w:t>
-      </w:r>
-    </w:p>
-    <w:p>
-      <w:r>
-        <w:t>---</w:t>
-      </w:r>
-    </w:p>
-    <w:p>
-      <w:pPr>
-        <w:pStyle w:val="Heading2"/>
-      </w:pPr>
-      <w:r>
-        <w:t>2. Project Timeline</w:t>
-      </w:r>
-    </w:p>
-    <w:p>
-      <w:r>
-        <w:t>The development cycle is organized into eight distinct phases:</w:t>
-      </w:r>
-    </w:p>
-    <w:tbl>
-      <w:tblPr>
-        <w:tblStyle w:val="TableGrid"/>
-        <w:tblW w:type="auto" w:w="0"/>
-        <w:tblLook w:firstColumn="1" w:firstRow="1" w:lastColumn="0" w:lastRow="0" w:noHBand="0" w:noVBand="1" w:val="04A0"/>
-      </w:tblPr>
-      <w:tblGrid>
-        <w:gridCol w:w="1440"/>
-        <w:gridCol w:w="1440"/>
-        <w:gridCol w:w="1440"/>
-        <w:gridCol w:w="1440"/>
-        <w:gridCol w:w="1440"/>
-        <w:gridCol w:w="1440"/>
-      </w:tblGrid>
-      <w:tr>
-        <w:tc>
-          <w:tcPr>
-            <w:tcW w:type="dxa" w:w="1440"/>
-            <w:shd w:fill="2563EB"/>
-          </w:tcPr>
-          <w:p>
-            <w:r>
-              <w:rPr>
-                <w:b/>
-                <w:color w:val="FFFFFF"/>
-              </w:rPr>
-              <w:t>Phase</w:t>
-            </w:r>
-          </w:p>
-        </w:tc>
-        <w:tc>
-          <w:tcPr>
-            <w:tcW w:type="dxa" w:w="1440"/>
-            <w:shd w:fill="2563EB"/>
-          </w:tcPr>
-          <w:p>
-            <w:r>
-              <w:rPr>
-                <w:b/>
-                <w:color w:val="FFFFFF"/>
-              </w:rPr>
-              <w:t>Task Description</w:t>
-            </w:r>
-          </w:p>
-        </w:tc>
-        <w:tc>
-          <w:tcPr>
-            <w:tcW w:type="dxa" w:w="1440"/>
-            <w:shd w:fill="2563EB"/>
-          </w:tcPr>
-          <w:p>
-            <w:r>
-              <w:rPr>
-                <w:b/>
-                <w:color w:val="FFFFFF"/>
-              </w:rPr>
-              <w:t>Planned Duration</w:t>
-            </w:r>
-          </w:p>
-        </w:tc>
-        <w:tc>
-          <w:tcPr>
-            <w:tcW w:type="dxa" w:w="1440"/>
-            <w:shd w:fill="2563EB"/>
-          </w:tcPr>
-          <w:p>
-            <w:r>
-              <w:rPr>
-                <w:b/>
-                <w:color w:val="FFFFFF"/>
-              </w:rPr>
-              <w:t>Start Day</w:t>
-            </w:r>
-          </w:p>
-        </w:tc>
-        <w:tc>
-          <w:tcPr>
-            <w:tcW w:type="dxa" w:w="1440"/>
-            <w:shd w:fill="2563EB"/>
-          </w:tcPr>
-          <w:p>
-            <w:r>
-              <w:rPr>
-                <w:b/>
-                <w:color w:val="FFFFFF"/>
-              </w:rPr>
-              <w:t>End Day</w:t>
-            </w:r>
-          </w:p>
-        </w:tc>
-        <w:tc>
-          <w:tcPr>
-            <w:tcW w:type="dxa" w:w="1440"/>
-            <w:shd w:fill="2563EB"/>
-          </w:tcPr>
-          <w:p>
-            <w:r>
-              <w:rPr>
-                <w:b/>
-                <w:color w:val="FFFFFF"/>
-              </w:rPr>
-              <w:t>Status</w:t>
-            </w:r>
-          </w:p>
-        </w:tc>
-      </w:tr>
-      <w:tr>
-        <w:tc>
-          <w:tcPr>
-            <w:tcW w:type="dxa" w:w="1440"/>
-          </w:tcPr>
-          <w:p>
-            <w:r>
-              <w:t>**Phase 1**</w:t>
-            </w:r>
-          </w:p>
-        </w:tc>
-        <w:tc>
-          <w:tcPr>
-            <w:tcW w:type="dxa" w:w="1440"/>
-          </w:tcPr>
-          <w:p>
-            <w:r>
-              <w:t>Brainstorming &amp; Ideation</w:t>
-            </w:r>
-          </w:p>
-        </w:tc>
-        <w:tc>
-          <w:tcPr>
-            <w:tcW w:type="dxa" w:w="1440"/>
-          </w:tcPr>
-          <w:p>
-            <w:r>
-              <w:t>1 Day</w:t>
-            </w:r>
-          </w:p>
-        </w:tc>
-        <w:tc>
-          <w:tcPr>
-            <w:tcW w:type="dxa" w:w="1440"/>
-          </w:tcPr>
-          <w:p>
-            <w:r>
-              <w:t>Day 1</w:t>
-            </w:r>
-          </w:p>
-        </w:tc>
-        <w:tc>
-          <w:tcPr>
-            <w:tcW w:type="dxa" w:w="1440"/>
-          </w:tcPr>
-          <w:p>
-            <w:r>
-              <w:t>Day 1</w:t>
-            </w:r>
-          </w:p>
-        </w:tc>
-        <w:tc>
-          <w:tcPr>
-            <w:tcW w:type="dxa" w:w="1440"/>
-          </w:tcPr>
-          <w:p>
-            <w:r>
-              <w:t>✅ Complete</w:t>
-            </w:r>
-          </w:p>
-        </w:tc>
-      </w:tr>
-      <w:tr>
-        <w:tc>
-          <w:tcPr>
-            <w:tcW w:type="dxa" w:w="1440"/>
-            <w:shd w:fill="F8FAFC"/>
-          </w:tcPr>
-          <w:p>
-            <w:r>
-              <w:t>**Phase 2**</w:t>
-            </w:r>
-          </w:p>
-        </w:tc>
-        <w:tc>
-          <w:tcPr>
-            <w:tcW w:type="dxa" w:w="1440"/>
-            <w:shd w:fill="F8FAFC"/>
-          </w:tcPr>
-          <w:p>
-            <w:r>
-              <w:t>Requirement Analysis</w:t>
-            </w:r>
-          </w:p>
-        </w:tc>
-        <w:tc>
-          <w:tcPr>
-            <w:tcW w:type="dxa" w:w="1440"/>
-            <w:shd w:fill="F8FAFC"/>
-          </w:tcPr>
-          <w:p>
-            <w:r>
-              <w:t>1 Day</w:t>
-            </w:r>
-          </w:p>
-        </w:tc>
-        <w:tc>
-          <w:tcPr>
-            <w:tcW w:type="dxa" w:w="1440"/>
-            <w:shd w:fill="F8FAFC"/>
-          </w:tcPr>
-          <w:p>
-            <w:r>
-              <w:t>Day 1</w:t>
-            </w:r>
-          </w:p>
-        </w:tc>
-        <w:tc>
-          <w:tcPr>
-            <w:tcW w:type="dxa" w:w="1440"/>
-            <w:shd w:fill="F8FAFC"/>
-          </w:tcPr>
-          <w:p>
-            <w:r>
-              <w:t>Day 2</w:t>
-            </w:r>
-          </w:p>
-        </w:tc>
-        <w:tc>
-          <w:tcPr>
-            <w:tcW w:type="dxa" w:w="1440"/>
-            <w:shd w:fill="F8FAFC"/>
-          </w:tcPr>
-          <w:p>
-            <w:r>
-              <w:t>✅ Complete</w:t>
-            </w:r>
-          </w:p>
-        </w:tc>
-      </w:tr>
-      <w:tr>
-        <w:tc>
-          <w:tcPr>
-            <w:tcW w:type="dxa" w:w="1440"/>
-          </w:tcPr>
-          <w:p>
-            <w:r>
-              <w:t>**Phase 3**</w:t>
-            </w:r>
-          </w:p>
-        </w:tc>
-        <w:tc>
-          <w:tcPr>
-            <w:tcW w:type="dxa" w:w="1440"/>
-          </w:tcPr>
-          <w:p>
-            <w:r>
-              <w:t>Project Design Phase</w:t>
-            </w:r>
-          </w:p>
-        </w:tc>
-        <w:tc>
-          <w:tcPr>
-            <w:tcW w:type="dxa" w:w="1440"/>
-          </w:tcPr>
-          <w:p>
-            <w:r>
-              <w:t>1 Day</w:t>
-            </w:r>
-          </w:p>
-        </w:tc>
-        <w:tc>
-          <w:tcPr>
-            <w:tcW w:type="dxa" w:w="1440"/>
-          </w:tcPr>
-          <w:p>
-            <w:r>
-              <w:t>Day 2</w:t>
-            </w:r>
-          </w:p>
-        </w:tc>
-        <w:tc>
-          <w:tcPr>
-            <w:tcW w:type="dxa" w:w="1440"/>
-          </w:tcPr>
-          <w:p>
-            <w:r>
-              <w:t>Day 3</w:t>
-            </w:r>
-          </w:p>
-        </w:tc>
-        <w:tc>
-          <w:tcPr>
-            <w:tcW w:type="dxa" w:w="1440"/>
-          </w:tcPr>
-          <w:p>
-            <w:r>
-              <w:t>✅ Complete</w:t>
-            </w:r>
-          </w:p>
-        </w:tc>
-      </w:tr>
-      <w:tr>
-        <w:tc>
-          <w:tcPr>
-            <w:tcW w:type="dxa" w:w="1440"/>
-            <w:shd w:fill="F8FAFC"/>
-          </w:tcPr>
-          <w:p>
-            <w:r>
-              <w:t>**Phase 4**</w:t>
-            </w:r>
-          </w:p>
-        </w:tc>
-        <w:tc>
-          <w:tcPr>
-            <w:tcW w:type="dxa" w:w="1440"/>
-            <w:shd w:fill="F8FAFC"/>
-          </w:tcPr>
-          <w:p>
-            <w:r>
-              <w:t>Project Planning Phase</w:t>
-            </w:r>
-          </w:p>
-        </w:tc>
-        <w:tc>
-          <w:tcPr>
-            <w:tcW w:type="dxa" w:w="1440"/>
-            <w:shd w:fill="F8FAFC"/>
-          </w:tcPr>
-          <w:p>
-            <w:r>
-              <w:t>1 Day</w:t>
-            </w:r>
-          </w:p>
-        </w:tc>
-        <w:tc>
-          <w:tcPr>
-            <w:tcW w:type="dxa" w:w="1440"/>
-            <w:shd w:fill="F8FAFC"/>
-          </w:tcPr>
-          <w:p>
-            <w:r>
-              <w:t>Day 3</w:t>
-            </w:r>
-          </w:p>
-        </w:tc>
-        <w:tc>
-          <w:tcPr>
-            <w:tcW w:type="dxa" w:w="1440"/>
-            <w:shd w:fill="F8FAFC"/>
-          </w:tcPr>
-          <w:p>
-            <w:r>
-              <w:t>Day 3</w:t>
-            </w:r>
-          </w:p>
-        </w:tc>
-        <w:tc>
-          <w:tcPr>
-            <w:tcW w:type="dxa" w:w="1440"/>
-            <w:shd w:fill="F8FAFC"/>
-          </w:tcPr>
-          <w:p>
-            <w:r>
-              <w:t>✅ Complete</w:t>
-            </w:r>
-          </w:p>
-        </w:tc>
-      </w:tr>
-      <w:tr>
-        <w:tc>
-          <w:tcPr>
-            <w:tcW w:type="dxa" w:w="1440"/>
-          </w:tcPr>
-          <w:p>
-            <w:r>
-              <w:t>**Phase 5**</w:t>
-            </w:r>
-          </w:p>
-        </w:tc>
-        <w:tc>
-          <w:tcPr>
-            <w:tcW w:type="dxa" w:w="1440"/>
-          </w:tcPr>
-          <w:p>
-            <w:r>
-              <w:t>Project Development Phase</w:t>
-            </w:r>
-          </w:p>
-        </w:tc>
-        <w:tc>
-          <w:tcPr>
-            <w:tcW w:type="dxa" w:w="1440"/>
-          </w:tcPr>
-          <w:p>
-            <w:r>
-              <w:t>4 Days</w:t>
-            </w:r>
-          </w:p>
-        </w:tc>
-        <w:tc>
-          <w:tcPr>
-            <w:tcW w:type="dxa" w:w="1440"/>
-          </w:tcPr>
-          <w:p>
-            <w:r>
-              <w:t>Day 3</w:t>
-            </w:r>
-          </w:p>
-        </w:tc>
-        <w:tc>
-          <w:tcPr>
-            <w:tcW w:type="dxa" w:w="1440"/>
-          </w:tcPr>
-          <w:p>
-            <w:r>
-              <w:t>Day 7</w:t>
-            </w:r>
-          </w:p>
-        </w:tc>
-        <w:tc>
-          <w:tcPr>
-            <w:tcW w:type="dxa" w:w="1440"/>
-          </w:tcPr>
-          <w:p>
-            <w:r>
-              <w:t>✅ Complete</w:t>
-            </w:r>
-          </w:p>
-        </w:tc>
-      </w:tr>
-      <w:tr>
-        <w:tc>
-          <w:tcPr>
-            <w:tcW w:type="dxa" w:w="1440"/>
-            <w:shd w:fill="F8FAFC"/>
-          </w:tcPr>
-          <w:p>
-            <w:r>
-              <w:t>**Phase 6**</w:t>
-            </w:r>
-          </w:p>
-        </w:tc>
-        <w:tc>
-          <w:tcPr>
-            <w:tcW w:type="dxa" w:w="1440"/>
-            <w:shd w:fill="F8FAFC"/>
-          </w:tcPr>
-          <w:p>
-            <w:r>
-              <w:t>Project Testing</w:t>
-            </w:r>
-          </w:p>
-        </w:tc>
-        <w:tc>
-          <w:tcPr>
-            <w:tcW w:type="dxa" w:w="1440"/>
-            <w:shd w:fill="F8FAFC"/>
-          </w:tcPr>
-          <w:p>
-            <w:r>
-              <w:t>1 Day</w:t>
-            </w:r>
-          </w:p>
-        </w:tc>
-        <w:tc>
-          <w:tcPr>
-            <w:tcW w:type="dxa" w:w="1440"/>
-            <w:shd w:fill="F8FAFC"/>
-          </w:tcPr>
-          <w:p>
-            <w:r>
-              <w:t>Day 7</w:t>
-            </w:r>
-          </w:p>
-        </w:tc>
-        <w:tc>
-          <w:tcPr>
-            <w:tcW w:type="dxa" w:w="1440"/>
-            <w:shd w:fill="F8FAFC"/>
-          </w:tcPr>
-          <w:p>
-            <w:r>
-              <w:t>Day 8</w:t>
-            </w:r>
-          </w:p>
-        </w:tc>
-        <w:tc>
-          <w:tcPr>
-            <w:tcW w:type="dxa" w:w="1440"/>
-            <w:shd w:fill="F8FAFC"/>
-          </w:tcPr>
-          <w:p>
-            <w:r>
-              <w:t>✅ Complete</w:t>
-            </w:r>
-          </w:p>
-        </w:tc>
-      </w:tr>
-      <w:tr>
-        <w:tc>
-          <w:tcPr>
-            <w:tcW w:type="dxa" w:w="1440"/>
-          </w:tcPr>
-          <w:p>
-            <w:r>
-              <w:t>**Phase 7**</w:t>
-            </w:r>
-          </w:p>
-        </w:tc>
-        <w:tc>
-          <w:tcPr>
-            <w:tcW w:type="dxa" w:w="1440"/>
-          </w:tcPr>
-          <w:p>
-            <w:r>
-              <w:t>Project Documentation</w:t>
-            </w:r>
-          </w:p>
-        </w:tc>
-        <w:tc>
-          <w:tcPr>
-            <w:tcW w:type="dxa" w:w="1440"/>
-          </w:tcPr>
-          <w:p>
-            <w:r>
-              <w:t>1 Day</w:t>
-            </w:r>
-          </w:p>
-        </w:tc>
-        <w:tc>
-          <w:tcPr>
-            <w:tcW w:type="dxa" w:w="1440"/>
-          </w:tcPr>
-          <w:p>
-            <w:r>
-              <w:t>Day 8</w:t>
-            </w:r>
-          </w:p>
-        </w:tc>
-        <w:tc>
-          <w:tcPr>
-            <w:tcW w:type="dxa" w:w="1440"/>
-          </w:tcPr>
-          <w:p>
-            <w:r>
-              <w:t>Day 9</w:t>
-            </w:r>
-          </w:p>
-        </w:tc>
-        <w:tc>
-          <w:tcPr>
-            <w:tcW w:type="dxa" w:w="1440"/>
-          </w:tcPr>
-          <w:p>
-            <w:r>
-              <w:t>✅ Complete</w:t>
-            </w:r>
-          </w:p>
-        </w:tc>
-      </w:tr>
-      <w:tr>
-        <w:tc>
-          <w:tcPr>
-            <w:tcW w:type="dxa" w:w="1440"/>
-            <w:shd w:fill="F8FAFC"/>
-          </w:tcPr>
-          <w:p>
-            <w:r>
-              <w:t>**Phase 8**</w:t>
-            </w:r>
-          </w:p>
-        </w:tc>
-        <w:tc>
-          <w:tcPr>
-            <w:tcW w:type="dxa" w:w="1440"/>
-            <w:shd w:fill="F8FAFC"/>
-          </w:tcPr>
-          <w:p>
-            <w:r>
-              <w:t>Project Demonstration</w:t>
-            </w:r>
-          </w:p>
-        </w:tc>
-        <w:tc>
-          <w:tcPr>
-            <w:tcW w:type="dxa" w:w="1440"/>
-            <w:shd w:fill="F8FAFC"/>
-          </w:tcPr>
-          <w:p>
-            <w:r>
-              <w:t>1 Day</w:t>
-            </w:r>
-          </w:p>
-        </w:tc>
-        <w:tc>
-          <w:tcPr>
-            <w:tcW w:type="dxa" w:w="1440"/>
-            <w:shd w:fill="F8FAFC"/>
-          </w:tcPr>
-          <w:p>
-            <w:r>
-              <w:t>Day 9</w:t>
-            </w:r>
-          </w:p>
-        </w:tc>
-        <w:tc>
-          <w:tcPr>
-            <w:tcW w:type="dxa" w:w="1440"/>
-            <w:shd w:fill="F8FAFC"/>
-          </w:tcPr>
-          <w:p>
-            <w:r>
-              <w:t>Day 10</w:t>
-            </w:r>
-          </w:p>
-        </w:tc>
-        <w:tc>
-          <w:tcPr>
-            <w:tcW w:type="dxa" w:w="1440"/>
-            <w:shd w:fill="F8FAFC"/>
-          </w:tcPr>
-          <w:p>
-            <w:r>
-              <w:t>✅ Complete</w:t>
-            </w:r>
-          </w:p>
-        </w:tc>
-      </w:tr>
-    </w:tbl>
-    <w:p>
-      <w:r>
-        <w:t>---</w:t>
-      </w:r>
-    </w:p>
-    <w:p>
-      <w:pPr>
-        <w:pStyle w:val="Heading2"/>
-      </w:pPr>
-      <w:r>
-        <w:t>3. Sprint Breakdown</w:t>
-      </w:r>
-    </w:p>
-    <w:p>
-      <w:r>
-        <w:t>The project was executed in four sprints:</w:t>
-      </w:r>
-    </w:p>
-    <w:p>
-      <w:pPr>
-        <w:pStyle w:val="Heading3"/>
-      </w:pPr>
-      <w:r>
-        <w:t>Sprint 1: Conception &amp; Foundation (Days 1–3)</w:t>
-      </w:r>
-    </w:p>
-    <w:p>
-      <w:pPr>
-        <w:pStyle w:val="ListBullet"/>
-      </w:pPr>
-      <w:r/>
-      <w:r>
-        <w:rPr>
-          <w:b/>
-        </w:rPr>
-        <w:t>Goals</w:t>
-      </w:r>
-      <w:r>
-        <w:t>: Define project scope, target personas, and design the system architecture.</w:t>
-      </w:r>
-    </w:p>
-    <w:p>
-      <w:pPr>
-        <w:pStyle w:val="ListBullet"/>
-      </w:pPr>
-      <w:r/>
-      <w:r>
-        <w:rPr>
-          <w:b/>
-        </w:rPr>
-        <w:t>Tasks</w:t>
-      </w:r>
-      <w:r>
-        <w:t>:</w:t>
-      </w:r>
-    </w:p>
-    <w:p>
-      <w:pPr>
-        <w:pStyle w:val="ListBullet"/>
-      </w:pPr>
-      <w:r>
-        <w:t>Define problem statements and empathy maps.</w:t>
-      </w:r>
-    </w:p>
-    <w:p>
-      <w:pPr>
-        <w:pStyle w:val="ListBullet"/>
-      </w:pPr>
-      <w:r>
-        <w:t>Complete customer journey and data flow mapping.</w:t>
-      </w:r>
-    </w:p>
-    <w:p>
-      <w:pPr>
-        <w:pStyle w:val="ListBullet"/>
-      </w:pPr>
-      <w:r>
-        <w:t>Design the database schema and choose the technology stack.</w:t>
-      </w:r>
-    </w:p>
-    <w:p>
-      <w:pPr>
-        <w:pStyle w:val="ListBullet"/>
-      </w:pPr>
-      <w:r>
-        <w:t>Set up the directory structure and Python virtual environment.</w:t>
-      </w:r>
-    </w:p>
-    <w:p>
-      <w:pPr>
-        <w:pStyle w:val="Heading3"/>
-      </w:pPr>
-      <w:r>
-        <w:t>Sprint 2: Core Development &amp; Model Training (Days 3–6)</w:t>
-      </w:r>
-    </w:p>
-    <w:p>
-      <w:pPr>
-        <w:pStyle w:val="ListBullet"/>
-      </w:pPr>
-      <w:r/>
-      <w:r>
-        <w:rPr>
-          <w:b/>
-        </w:rPr>
-        <w:t>Goals</w:t>
-      </w:r>
-      <w:r>
-        <w:t>: Develop the data cleaning, model training, and application backend routes.</w:t>
-      </w:r>
-    </w:p>
-    <w:p>
-      <w:pPr>
-        <w:pStyle w:val="ListBullet"/>
-      </w:pPr>
-      <w:r/>
-      <w:r>
-        <w:rPr>
-          <w:b/>
-        </w:rPr>
-        <w:t>Tasks</w:t>
-      </w:r>
-      <w:r>
-        <w:t>:</w:t>
-      </w:r>
-    </w:p>
-    <w:p>
-      <w:pPr>
-        <w:pStyle w:val="ListBullet"/>
-      </w:pPr>
-      <w:r>
-        <w:t>Implement data loading and preprocessing routines.</w:t>
-      </w:r>
-    </w:p>
-    <w:p>
-      <w:pPr>
-        <w:pStyle w:val="ListBullet"/>
-      </w:pPr>
-      <w:r>
-        <w:t>Train, evaluate, and serialize the Linear Regression model.</w:t>
-      </w:r>
-    </w:p>
-    <w:p>
-      <w:pPr>
-        <w:pStyle w:val="ListBullet"/>
-      </w:pPr>
-      <w:r>
-        <w:t>Create backend router endpoints using Flask.</w:t>
-      </w:r>
-    </w:p>
-    <w:p>
-      <w:pPr>
-        <w:pStyle w:val="ListBullet"/>
-      </w:pPr>
-      <w:r>
-        <w:t>Build HTML validation forms for development indicators.</w:t>
-      </w:r>
-    </w:p>
-    <w:p>
-      <w:pPr>
-        <w:pStyle w:val="ListBullet"/>
-      </w:pPr>
-      <w:r>
-        <w:t>Implement the tier classification and insights engine.</w:t>
-      </w:r>
-    </w:p>
-    <w:p>
-      <w:pPr>
-        <w:pStyle w:val="Heading3"/>
-      </w:pPr>
-      <w:r>
-        <w:t>Sprint 3: Visual Polish &amp; User Interface (Days 6–7)</w:t>
-      </w:r>
-    </w:p>
-    <w:p>
-      <w:pPr>
-        <w:pStyle w:val="ListBullet"/>
-      </w:pPr>
-      <w:r/>
-      <w:r>
-        <w:rPr>
-          <w:b/>
-        </w:rPr>
-        <w:t>Goals</w:t>
-      </w:r>
-      <w:r>
-        <w:t>: Apply design styling and visual enhancements to the frontend.</w:t>
-      </w:r>
-    </w:p>
-    <w:p>
-      <w:pPr>
-        <w:pStyle w:val="ListBullet"/>
-      </w:pPr>
-      <w:r/>
-      <w:r>
-        <w:rPr>
-          <w:b/>
-        </w:rPr>
-        <w:t>Tasks</w:t>
-      </w:r>
-      <w:r>
-        <w:t>:</w:t>
-      </w:r>
-    </w:p>
-    <w:p>
-      <w:pPr>
-        <w:pStyle w:val="ListBullet"/>
-      </w:pPr>
-      <w:r>
-        <w:t>Create the custom CSS style sheet using dark-mode glassmorphism.</w:t>
-      </w:r>
-    </w:p>
-    <w:p>
-      <w:pPr>
-        <w:pStyle w:val="ListBullet"/>
-      </w:pPr>
-      <w:r>
-        <w:t>Implement dynamic badges and visual gauges for predicted scores.</w:t>
-      </w:r>
-    </w:p>
-    <w:p>
-      <w:pPr>
-        <w:pStyle w:val="ListBullet"/>
-      </w:pPr>
-      <w:r>
-        <w:t>Ensure layout responsiveness across all screen sizes.</w:t>
-      </w:r>
-    </w:p>
-    <w:p>
-      <w:pPr>
-        <w:pStyle w:val="ListBullet"/>
-      </w:pPr>
-      <w:r>
-        <w:t>Add micro-animations and transitions to forms and cards.</w:t>
-      </w:r>
-    </w:p>
-    <w:p>
-      <w:pPr>
-        <w:pStyle w:val="Heading3"/>
-      </w:pPr>
-      <w:r>
-        <w:t>Sprint 4: Quality Assurance &amp; Delivery (Days 7–10)</w:t>
-      </w:r>
-    </w:p>
-    <w:p>
-      <w:pPr>
-        <w:pStyle w:val="ListBullet"/>
-      </w:pPr>
-      <w:r/>
-      <w:r>
-        <w:rPr>
-          <w:b/>
-        </w:rPr>
-        <w:t>Goals</w:t>
-      </w:r>
-      <w:r>
-        <w:t>: Conduct model evaluation, user testing, and complete documentation.</w:t>
-      </w:r>
-    </w:p>
-    <w:p>
-      <w:pPr>
-        <w:pStyle w:val="ListBullet"/>
-      </w:pPr>
-      <w:r/>
-      <w:r>
-        <w:rPr>
-          <w:b/>
-        </w:rPr>
-        <w:t>Tasks</w:t>
-      </w:r>
-      <w:r>
-        <w:t>:</w:t>
-      </w:r>
-    </w:p>
-    <w:p>
-      <w:pPr>
-        <w:pStyle w:val="ListBullet"/>
-      </w:pPr>
-      <w:r>
-        <w:t>Execute functional tests on predicted scores and boundary conditions.</w:t>
-      </w:r>
-    </w:p>
-    <w:p>
-      <w:pPr>
-        <w:pStyle w:val="ListBullet"/>
-      </w:pPr>
-      <w:r>
-        <w:t>Conduct user acceptance testing (UAT).</w:t>
-      </w:r>
-    </w:p>
-    <w:p>
-      <w:pPr>
-        <w:pStyle w:val="ListBullet"/>
-      </w:pPr>
-      <w:r>
-        <w:t>Draft SDLC reports and convert files to editable Word formats.</w:t>
-      </w:r>
-    </w:p>
-    <w:p>
-      <w:r>
-        <w:t>---</w:t>
-      </w:r>
-    </w:p>
-    <w:p>
-      <w:pPr>
-        <w:pStyle w:val="Heading2"/>
-      </w:pPr>
-      <w:r>
-        <w:t>4. Risk Assessment &amp; Mitigation</w:t>
-      </w:r>
-    </w:p>
-    <w:tbl>
-      <w:tblPr>
-        <w:tblStyle w:val="TableGrid"/>
-        <w:tblW w:type="auto" w:w="0"/>
-        <w:tblLook w:firstColumn="1" w:firstRow="1" w:lastColumn="0" w:lastRow="0" w:noHBand="0" w:noVBand="1" w:val="04A0"/>
-      </w:tblPr>
-      <w:tblGrid>
-        <w:gridCol w:w="2160"/>
-        <w:gridCol w:w="2160"/>
-        <w:gridCol w:w="2160"/>
-        <w:gridCol w:w="2160"/>
-      </w:tblGrid>
-      <w:tr>
-        <w:tc>
-          <w:tcPr>
-            <w:tcW w:type="dxa" w:w="2160"/>
-            <w:shd w:fill="2563EB"/>
-          </w:tcPr>
-          <w:p>
-            <w:r>
-              <w:rPr>
-                <w:b/>
-                <w:color w:val="FFFFFF"/>
-              </w:rPr>
-              <w:t>Risk Description</w:t>
-            </w:r>
-          </w:p>
-        </w:tc>
-        <w:tc>
-          <w:tcPr>
-            <w:tcW w:type="dxa" w:w="2160"/>
-            <w:shd w:fill="2563EB"/>
-          </w:tcPr>
-          <w:p>
-            <w:r>
-              <w:rPr>
-                <w:b/>
-                <w:color w:val="FFFFFF"/>
-              </w:rPr>
-              <w:t>Probability</w:t>
-            </w:r>
-          </w:p>
-        </w:tc>
-        <w:tc>
-          <w:tcPr>
-            <w:tcW w:type="dxa" w:w="2160"/>
-            <w:shd w:fill="2563EB"/>
-          </w:tcPr>
-          <w:p>
-            <w:r>
-              <w:rPr>
-                <w:b/>
-                <w:color w:val="FFFFFF"/>
-              </w:rPr>
-              <w:t>Impact</w:t>
-            </w:r>
-          </w:p>
-        </w:tc>
-        <w:tc>
-          <w:tcPr>
-            <w:tcW w:type="dxa" w:w="2160"/>
-            <w:shd w:fill="2563EB"/>
-          </w:tcPr>
-          <w:p>
-            <w:r>
-              <w:rPr>
-                <w:b/>
-                <w:color w:val="FFFFFF"/>
-              </w:rPr>
-              <w:t>Mitigation Strategy</w:t>
-            </w:r>
-          </w:p>
-        </w:tc>
-      </w:tr>
-      <w:tr>
-        <w:tc>
-          <w:tcPr>
-            <w:tcW w:type="dxa" w:w="2160"/>
-          </w:tcPr>
-          <w:p>
-            <w:r>
-              <w:t>**Model Underfitting**</w:t>
-            </w:r>
-          </w:p>
-        </w:tc>
-        <w:tc>
-          <w:tcPr>
-            <w:tcW w:type="dxa" w:w="2160"/>
-          </w:tcPr>
-          <w:p>
-            <w:r>
-              <w:t>Medium</w:t>
-            </w:r>
-          </w:p>
-        </w:tc>
-        <w:tc>
-          <w:tcPr>
-            <w:tcW w:type="dxa" w:w="2160"/>
-          </w:tcPr>
-          <w:p>
-            <w:r>
-              <w:t>High</w:t>
-            </w:r>
-          </w:p>
-        </w:tc>
-        <w:tc>
-          <w:tcPr>
-            <w:tcW w:type="dxa" w:w="2160"/>
-          </w:tcPr>
-          <w:p>
-            <w:r>
-              <w:t>Select the most relevant features (EYS, MYS, Life Exp) and evaluate regression metrics.</w:t>
-            </w:r>
-          </w:p>
-        </w:tc>
-      </w:tr>
-      <w:tr>
-        <w:tc>
-          <w:tcPr>
-            <w:tcW w:type="dxa" w:w="2160"/>
-            <w:shd w:fill="F8FAFC"/>
-          </w:tcPr>
-          <w:p>
-            <w:r>
-              <w:t>**Small Dataset (200 records)**</w:t>
-            </w:r>
-          </w:p>
-        </w:tc>
-        <w:tc>
-          <w:tcPr>
-            <w:tcW w:type="dxa" w:w="2160"/>
-            <w:shd w:fill="F8FAFC"/>
-          </w:tcPr>
-          <w:p>
-            <w:r>
-              <w:t>Medium</w:t>
-            </w:r>
-          </w:p>
-        </w:tc>
-        <w:tc>
-          <w:tcPr>
-            <w:tcW w:type="dxa" w:w="2160"/>
-            <w:shd w:fill="F8FAFC"/>
-          </w:tcPr>
-          <w:p>
-            <w:r>
-              <w:t>Medium</w:t>
-            </w:r>
-          </w:p>
-        </w:tc>
-        <w:tc>
-          <w:tcPr>
-            <w:tcW w:type="dxa" w:w="2160"/>
-            <w:shd w:fill="F8FAFC"/>
-          </w:tcPr>
-          <w:p>
-            <w:r>
-              <w:t>Use cross-validation during model training and perform boundary value validation.</w:t>
-            </w:r>
-          </w:p>
-        </w:tc>
-      </w:tr>
-      <w:tr>
-        <w:tc>
-          <w:tcPr>
-            <w:tcW w:type="dxa" w:w="2160"/>
-          </w:tcPr>
-          <w:p>
-            <w:r>
-              <w:t>**PowerShell Activation Policy Block**</w:t>
-            </w:r>
-          </w:p>
-        </w:tc>
-        <w:tc>
-          <w:tcPr>
-            <w:tcW w:type="dxa" w:w="2160"/>
-          </w:tcPr>
-          <w:p>
-            <w:r>
-              <w:t>High</w:t>
-            </w:r>
-          </w:p>
-        </w:tc>
-        <w:tc>
-          <w:tcPr>
-            <w:tcW w:type="dxa" w:w="2160"/>
-          </w:tcPr>
-          <w:p>
-            <w:r>
-              <w:t>Low</w:t>
-            </w:r>
-          </w:p>
-        </w:tc>
-        <w:tc>
-          <w:tcPr>
-            <w:tcW w:type="dxa" w:w="2160"/>
-          </w:tcPr>
-          <w:p>
-            <w:r>
-              <w:t>Provide activation instructions with set policy commands (`RemoteSigned`).</w:t>
-            </w:r>
-          </w:p>
-        </w:tc>
-      </w:tr>
-      <w:tr>
-        <w:tc>
-          <w:tcPr>
-            <w:tcW w:type="dxa" w:w="2160"/>
-            <w:shd w:fill="F8FAFC"/>
-          </w:tcPr>
-          <w:p>
-            <w:r>
-              <w:t>**Path Resolution Failures**</w:t>
-            </w:r>
-          </w:p>
-        </w:tc>
-        <w:tc>
-          <w:tcPr>
-            <w:tcW w:type="dxa" w:w="2160"/>
-            <w:shd w:fill="F8FAFC"/>
-          </w:tcPr>
-          <w:p>
-            <w:r>
-              <w:t>Medium</w:t>
-            </w:r>
-          </w:p>
-        </w:tc>
-        <w:tc>
-          <w:tcPr>
-            <w:tcW w:type="dxa" w:w="2160"/>
-            <w:shd w:fill="F8FAFC"/>
-          </w:tcPr>
-          <w:p>
-            <w:r>
-              <w:t>High</w:t>
-            </w:r>
-          </w:p>
-        </w:tc>
-        <w:tc>
-          <w:tcPr>
-            <w:tcW w:type="dxa" w:w="2160"/>
-            <w:shd w:fill="F8FAFC"/>
-          </w:tcPr>
-          <w:p>
-            <w:r>
-              <w:t>Use absolute path resolution (`os.path.abspath`) in the application file structure.</w:t>
-            </w:r>
-          </w:p>
-        </w:tc>
-      </w:tr>
-      <w:tr>
-        <w:tc>
-          <w:tcPr>
-            <w:tcW w:type="dxa" w:w="2160"/>
-          </w:tcPr>
-          <w:p>
-            <w:r>
-              <w:t>**Git Push Denial (403 Forbidden)**</w:t>
-            </w:r>
-          </w:p>
-        </w:tc>
-        <w:tc>
-          <w:tcPr>
-            <w:tcW w:type="dxa" w:w="2160"/>
-          </w:tcPr>
-          <w:p>
-            <w:r>
-              <w:t>High</w:t>
-            </w:r>
-          </w:p>
-        </w:tc>
-        <w:tc>
-          <w:tcPr>
-            <w:tcW w:type="dxa" w:w="2160"/>
-          </w:tcPr>
-          <w:p>
-            <w:r>
-              <w:t>Medium</w:t>
-            </w:r>
-          </w:p>
-        </w:tc>
-        <w:tc>
-          <w:tcPr>
-            <w:tcW w:type="dxa" w:w="2160"/>
-          </w:tcPr>
-          <w:p>
-            <w:r>
-              <w:t>Configure personal repositories as remotes and push to user forks.</w:t>
-            </w:r>
-          </w:p>
-        </w:tc>
-      </w:tr>
-    </w:tbl>
-    <w:p>
-      <w:r>
-        <w:t>---</w:t>
-      </w:r>
-    </w:p>
-    <w:p>
-      <w:pPr>
-        <w:pStyle w:val="Heading2"/>
-      </w:pPr>
-      <w:r>
-        <w:t>5. Resource Allocation</w:t>
-      </w:r>
-    </w:p>
-    <w:p>
-      <w:pPr>
-        <w:pStyle w:val="ListBullet"/>
-      </w:pPr>
-      <w:r/>
-      <w:r>
-        <w:rPr>
-          <w:b/>
-        </w:rPr>
-        <w:t>Personnel</w:t>
-      </w:r>
-      <w:r>
-        <w:t>: One Full-Stack Developer / Data Scientist.</w:t>
-      </w:r>
-    </w:p>
-    <w:p>
-      <w:pPr>
-        <w:pStyle w:val="ListBullet"/>
-      </w:pPr>
-      <w:r/>
-      <w:r>
-        <w:rPr>
-          <w:b/>
-        </w:rPr>
-        <w:t>Tools</w:t>
-      </w:r>
-      <w:r>
-        <w:t>: Python 3.12, PyCharm, Git, and Windows Command Line.</w:t>
-      </w:r>
-    </w:p>
-    <w:p>
-      <w:pPr>
-        <w:pStyle w:val="ListBullet"/>
-      </w:pPr>
-      <w:r/>
-      <w:r>
-        <w:rPr>
-          <w:b/>
-        </w:rPr>
-        <w:t>Deployment</w:t>
-      </w:r>
-      <w:r>
-        <w:t>: Local Flask development server.</w:t>
-      </w:r>
-    </w:p>
     <w:sectPr>
       <w:pgSz w:w="12240" w:h="15840"/>
       <w:pgMar w:top="1440" w:right="1800" w:bottom="1440" w:left="1800" w:header="720" w:footer="720" w:gutter="0"/>

</xml_diff>